<commit_message>
3 fold cv description deleted
</commit_message>
<xml_diff>
--- a/docs/paper.docx
+++ b/docs/paper.docx
@@ -244,7 +244,7 @@
           <w:szCs w:val="20"/>
           <w:rtl w:val="0"/>
         </w:rPr>
-        <w:t xml:space="preserve">The training and testing sets at different levels were splitted based on the following rules: (i) if a class contained only one member, it was included in both the training and testing sets; (ii) if a class contained two members, it was split 1:1 between training and testing; and (iii) if a class contained more than two members, it was split 80% for training and 20% for testing. To evaluate whether the models can correctly distinguish proteins that belong to a specific family from those belonging to other families within the same superfamily, an additional true negative set was created. For each family, proteins from other families within the same superfamily were selected as negative controls and added to the test set. The size of the negative control set was balanced against the number of positive samples, with a minimum of five negatives included when the positive set was small. Details of the data are shown in Table 1.</w:t>
+        <w:t xml:space="preserve">The training and testing sets at different levels were splitted based on the following rules: (i) if a class contained only one member, it was included in both the training and testing sets; (ii) if a class contained two members, it was split 1:1 between training and testing; and (iii) if a class contained more than two members, it was split 80% for training and 20% for testing. To evaluate whether the models can correctly distinguish proteins that belong to a specific target class from proteins outside that class, an additional true negative set was created. For each target class, proteins from different superfamilies were selected as negative controls and added to the test set. If a target class had no superfamily assignment, negative controls were drawn from proteins whose families did have superfamily assignments. The size of the negative control set was balanced against the number of positive samples, with a minimum of five negatives included when the positive set was small. Details of the data are shown in Table 1.</w:t>
       </w:r>
     </w:p>
     <w:p>
@@ -1614,12 +1614,7 @@
           <w:szCs w:val="20"/>
           <w:rtl w:val="0"/>
         </w:rPr>
-        <w:t xml:space="preserve">After concatenating these features, it yields a feature vector of dimension 4|V|, where V represents the number of unique domains. Finally, the entire feature matrix was standardized using z-score normalization.</w:t>
-      </w:r>
-      <w:r>
-        <w:rPr>
-          <w:rtl w:val="0"/>
-        </w:rPr>
+        <w:t xml:space="preserve">After concatenating these features, it yields a feature vector of dimension 4|V| + 111, where V represents the number of unique domains. The additional 111 dimensions correspond to 60 separator features, 50 domain-order features, and 1 domain-count feature. Finally, the entire feature matrix was standardized using z-score normalization.</w:t>
       </w:r>
     </w:p>
     <w:p>
@@ -2045,39 +2040,7 @@
           <w:szCs w:val="20"/>
           <w:rtl w:val="0"/>
         </w:rPr>
-        <w:t xml:space="preserve">For AUC, it corresponds to the area under this curve, which provides a scalar measure of classification performance ranging from 0.5 (random prediction) to 1.0 (perfect discrimination). Table 2 presents the results of different models using 3-fold cross-validation. </w:t>
-      </w:r>
-      <w:ins w:author="Patrick Tang" w:id="11" w:date="2025-09-04T04:14:32Z">
-        <w:r>
-          <w:rPr>
-            <w:rFonts w:ascii="Times New Roman" w:cs="Times New Roman" w:eastAsia="Times New Roman" w:hAnsi="Times New Roman"/>
-            <w:sz w:val="20"/>
-            <w:szCs w:val="20"/>
-            <w:rtl w:val="0"/>
-            <w:rPrChange w:author="Patrick Tang" w:id="12" w:date="2025-09-04T04:14:32Z">
-              <w:rPr>
-                <w:rFonts w:ascii="Times New Roman" w:cs="Times New Roman" w:eastAsia="Times New Roman" w:hAnsi="Times New Roman"/>
-                <w:sz w:val="20"/>
-                <w:szCs w:val="20"/>
-              </w:rPr>
-            </w:rPrChange>
-          </w:rPr>
-          <w:t xml:space="preserve">Specifically, the data is split into 3 folds with class-balanced splits. In each iteration, one fold is used as the test set, while the remaining 2 folds are combined into the training set. For consistency, the same folds were shared across all models in the training part. </w:t>
-        </w:r>
-      </w:ins>
-      <w:r>
-        <w:rPr>
-          <w:rFonts w:ascii="Times New Roman" w:cs="Times New Roman" w:eastAsia="Times New Roman" w:hAnsi="Times New Roman"/>
-          <w:sz w:val="20"/>
-          <w:szCs w:val="20"/>
-          <w:rtl w:val="0"/>
-        </w:rPr>
-        <w:t xml:space="preserve">The metrics are calculated as the average across the three folds with our customized true negative set included. The accuracy comparisons between different models at the family and subfamily levels are shown in Figure 1 and Figure 2.</w:t>
-      </w:r>
-      <w:r>
-        <w:rPr>
-          <w:rtl w:val="0"/>
-        </w:rPr>
+        <w:t xml:space="preserve">For AUC, it corresponds to the area under this curve, which provides a scalar measure of classification performance ranging from 0.5 (random prediction) to 1.0 (perfect discrimination). Table 2 presents the results of different models evaluated on the custom train/test split described above.</w:t>
       </w:r>
     </w:p>
     <w:p>
@@ -2117,21 +2080,7 @@
           <w:szCs w:val="20"/>
           <w:rtl w:val="0"/>
         </w:rPr>
-        <w:t xml:space="preserve">Table 2. 3-Fold Cross-Validation Classification Performance </w:t>
-      </w:r>
-      <w:r>
-        <w:rPr>
-          <w:rFonts w:ascii="Times New Roman" w:cs="Times New Roman" w:eastAsia="Times New Roman" w:hAnsi="Times New Roman"/>
-          <w:sz w:val="20"/>
-          <w:szCs w:val="20"/>
-          <w:rtl w:val="0"/>
-        </w:rPr>
-        <w:t xml:space="preserve">of TCDB Dataset In Each Level</w:t>
-      </w:r>
-      <w:r>
-        <w:rPr>
-          <w:rtl w:val="0"/>
-        </w:rPr>
+        <w:t xml:space="preserve">Table 2. Classification Performance of TCDB Dataset In Each Level</w:t>
       </w:r>
     </w:p>
     <w:tbl>
@@ -4900,7 +4849,7 @@
           <w:szCs w:val="20"/>
           <w:rtl w:val="0"/>
         </w:rPr>
-        <w:t xml:space="preserve">Through 3-fold cross validation, it shows that most models achieved very high accuracy (&gt;95%) at the family level. However, the accuracy values were generally lower at the subfamily level. Among the tested methods, the Neural Network and Extra Trees demonstrated the most balanced and consistent performance, especially in the subfamily-level. Neural Network, in particular, achieved the highest AUC score among all models at both family and subfamily levels.</w:t>
+        <w:t xml:space="preserve">Under this evaluation protocol, most models achieved very high accuracy (&gt;95%) at the family level. However, the accuracy values were generally lower at the subfamily level. Among the tested methods, the Neural Network and Extra Trees demonstrated the most balanced and consistent performance, especially in the subfamily-level. Neural Network, in particular, achieved the highest AUC score among all models at both family and subfamily levels.</w:t>
       </w:r>
     </w:p>
     <w:p>

</xml_diff>